<commit_message>
Updated missing UML diagram
</commit_message>
<xml_diff>
--- a/week 6/Stage_3_Lab_Student_Handout.docx
+++ b/week 6/Stage_3_Lab_Student_Handout.docx
@@ -1091,6 +1091,68 @@
     <w:p>
       <w:r>
         <w:t>Draw classes, attributes, operations, associations and multiplicities.</w:t>
+      </w:r>
+      <w:r>
+        <w:rPr>
+          <w:noProof/>
+        </w:rPr>
+        <w:drawing>
+          <wp:inline distT="0" distB="0" distL="0" distR="0" wp14:anchorId="0537DB8E" wp14:editId="47E31BC0">
+            <wp:extent cx="5623035" cy="4783485"/>
+            <wp:effectExtent l="0" t="0" r="3175" b="4445"/>
+            <wp:docPr id="1674983578" name="Picture 1"/>
+            <wp:cNvGraphicFramePr>
+              <a:graphicFrameLocks xmlns:a="http://schemas.openxmlformats.org/drawingml/2006/main" noChangeAspect="1"/>
+            </wp:cNvGraphicFramePr>
+            <a:graphic xmlns:a="http://schemas.openxmlformats.org/drawingml/2006/main">
+              <a:graphicData uri="http://schemas.openxmlformats.org/drawingml/2006/picture">
+                <pic:pic xmlns:pic="http://schemas.openxmlformats.org/drawingml/2006/picture">
+                  <pic:nvPicPr>
+                    <pic:cNvPr id="1674983578" name="Picture 1674983578"/>
+                    <pic:cNvPicPr/>
+                  </pic:nvPicPr>
+                  <pic:blipFill>
+                    <a:blip r:embed="rId6"/>
+                    <a:stretch>
+                      <a:fillRect/>
+                    </a:stretch>
+                  </pic:blipFill>
+                  <pic:spPr>
+                    <a:xfrm>
+                      <a:off x="0" y="0"/>
+                      <a:ext cx="5669403" cy="4822930"/>
+                    </a:xfrm>
+                    <a:prstGeom prst="rect">
+                      <a:avLst/>
+                    </a:prstGeom>
+                  </pic:spPr>
+                </pic:pic>
+              </a:graphicData>
+            </a:graphic>
+          </wp:inline>
+        </w:drawing>
+      </w:r>
+    </w:p>
+    <w:p/>
+    <w:p>
+      <w:r>
+        <w:t>Each appointment must be associated with exactly 1 patient</w:t>
+      </w:r>
+    </w:p>
+    <w:p>
+      <w:r>
+        <w:t>One patient can have zero, one or many Appointments.</w:t>
+      </w:r>
+    </w:p>
+    <w:p>
+      <w:r>
+        <w:t>Each Appointment must have exactly 1 practitioner.</w:t>
+      </w:r>
+    </w:p>
+    <w:p>
+      <w:r>
+        <w:lastRenderedPageBreak/>
+        <w:t>One Practitioner can have zero, one or many Appointments.</w:t>
       </w:r>
     </w:p>
     <w:p>
@@ -1393,7 +1455,7 @@
                     <pic:cNvPicPr/>
                   </pic:nvPicPr>
                   <pic:blipFill>
-                    <a:blip r:embed="rId6"/>
+                    <a:blip r:embed="rId7"/>
                     <a:stretch>
                       <a:fillRect/>
                     </a:stretch>

</xml_diff>